<commit_message>
fix: execução sem fiador sem a cláusula do fiador, data da notificação dinâmica, autoescape e requirements fixados
- templates/execucao/sem_fiador.docx: estava idêntico ao com_fiador; refeito sem a cláusula do fiador (texto do modelo anterior, layout atual)
- templates/notificacao/*: a data fixa 'São Paulo, 27 de janeiro de 2026.' do bloco de assinatura passa a {{ hoje_extenso }}
- server.py: doc.render(contexto, autoescape=True) — &, < e > nos dados não corrompem o documento
- requirements.txt: versões fixadas nas de produção (fastapi 0.136.3, uvicorn 0.48.0, docxtpl 0.20.2, python-docx 1.2.0)
- remove os templates '- old' e o criar_templates.py (não refletiam mais os templates em uso)
- README.md documentando o endpoint, payload e templates
</commit_message>
<xml_diff>
--- a/templates/execucao/sem_fiador.docx
+++ b/templates/execucao/sem_fiador.docx
@@ -159,92 +159,20 @@
         <w:rPr>
           <w:rFonts w:ascii="Libertinus Serif Display" w:hAnsi="Libertinus Serif Display"/>
         </w:rPr>
-        <w:t xml:space="preserve"> }}, e {{ Fiador }}, inscrito no CPF sob o nº {{ </w:t>
+        <w:t xml:space="preserve"> }}, pelas razões de fato e de direito a seguir expostas:</w:t>
       </w:r>
       <w:proofErr w:type="spellStart"/>
-      <w:r>
-        <w:rPr>
-          <w:rFonts w:ascii="Libertinus Serif Display" w:hAnsi="Libertinus Serif Display"/>
-        </w:rPr>
-        <w:t>fiador_cpf</w:t>
-      </w:r>
       <w:proofErr w:type="spellEnd"/>
-      <w:r>
-        <w:rPr>
-          <w:rFonts w:ascii="Libertinus Serif Display" w:hAnsi="Libertinus Serif Display"/>
-        </w:rPr>
-        <w:t xml:space="preserve"> }}, residente e domiciliado na {{ </w:t>
-      </w:r>
       <w:proofErr w:type="spellStart"/>
-      <w:r>
-        <w:rPr>
-          <w:rFonts w:ascii="Libertinus Serif Display" w:hAnsi="Libertinus Serif Display"/>
-        </w:rPr>
-        <w:t>fiador_endereco</w:t>
-      </w:r>
       <w:proofErr w:type="spellEnd"/>
-      <w:r>
-        <w:rPr>
-          <w:rFonts w:ascii="Libertinus Serif Display" w:hAnsi="Libertinus Serif Display"/>
-        </w:rPr>
-        <w:t xml:space="preserve"> }}, nº {{ </w:t>
-      </w:r>
       <w:proofErr w:type="spellStart"/>
-      <w:r>
-        <w:rPr>
-          <w:rFonts w:ascii="Libertinus Serif Display" w:hAnsi="Libertinus Serif Display"/>
-        </w:rPr>
-        <w:t>fiador_num_endereco</w:t>
-      </w:r>
       <w:proofErr w:type="spellEnd"/>
-      <w:r>
-        <w:rPr>
-          <w:rFonts w:ascii="Libertinus Serif Display" w:hAnsi="Libertinus Serif Display"/>
-        </w:rPr>
-        <w:t xml:space="preserve"> }} – Bairro {{ </w:t>
-      </w:r>
       <w:proofErr w:type="spellStart"/>
-      <w:r>
-        <w:rPr>
-          <w:rFonts w:ascii="Libertinus Serif Display" w:hAnsi="Libertinus Serif Display"/>
-        </w:rPr>
-        <w:t>fiador_bairro</w:t>
-      </w:r>
       <w:proofErr w:type="spellEnd"/>
-      <w:r>
-        <w:rPr>
-          <w:rFonts w:ascii="Libertinus Serif Display" w:hAnsi="Libertinus Serif Display"/>
-        </w:rPr>
-        <w:t xml:space="preserve"> }} – {{ </w:t>
-      </w:r>
       <w:proofErr w:type="spellStart"/>
-      <w:r>
-        <w:rPr>
-          <w:rFonts w:ascii="Libertinus Serif Display" w:hAnsi="Libertinus Serif Display"/>
-        </w:rPr>
-        <w:t>fiador_uf</w:t>
-      </w:r>
       <w:proofErr w:type="spellEnd"/>
-      <w:r>
-        <w:rPr>
-          <w:rFonts w:ascii="Libertinus Serif Display" w:hAnsi="Libertinus Serif Display"/>
-        </w:rPr>
-        <w:t xml:space="preserve"> }}, CEP {{ </w:t>
-      </w:r>
       <w:proofErr w:type="spellStart"/>
-      <w:r>
-        <w:rPr>
-          <w:rFonts w:ascii="Libertinus Serif Display" w:hAnsi="Libertinus Serif Display"/>
-        </w:rPr>
-        <w:t>fiador_cep</w:t>
-      </w:r>
       <w:proofErr w:type="spellEnd"/>
-      <w:r>
-        <w:rPr>
-          <w:rFonts w:ascii="Libertinus Serif Display" w:hAnsi="Libertinus Serif Display"/>
-        </w:rPr>
-        <w:t xml:space="preserve"> }}, na qualidade de FIADOR(A)/AVALISTA, pelas razões de fato e de direito a seguir expostas:</w:t>
-      </w:r>
     </w:p>
     <w:p>
       <w:pPr>

</xml_diff>